<commit_message>
docs(sim2real): V_MAX 已裁决——两机回滚到 1.0
用户确认 3.0 是临时改的、一直没回滚。已在两台真机改：
  NX01  V_MAX 3.0 -> 1.0
  NX02  V_MAX 2.0 -> 1.0
改前 .env 均备份为 .env.bak-<时间戳>，.env 里也留了回滚原因的注释。
两机现在只剩 LIDAR_IP 一项不同（出厂值，应当不同）。

这一改消掉两个隐患：
- 两机不等速。僚机没有独立避障、只能沿长机实飞轨迹跟；长机 3.0 而僚机
  2.0 时，"僚机已达速度上限"和"僚机掉队"在编队间距判据里分不开。
- 取值与注释脱节。.env 自己按实测 t_r=0.534s 推出的安全速度是 0.325
  (水平对角)/0.265(三维最坏)，3.0 高出一个数量级。

⚠ 尚未生效：.env 只在 compose up 时读取，不热加载。改完时两台的
flight-stack-hw 容器都在运行，容器内注入的仍是旧值（已 docker inspect
确认 NX01=3.0、NX02=2.0）。需要 down/up 重建容器才生效，重启动作留给用户。

⚠ 1.0 仍高于那个 0.325 的推导值。推导里的 150ms 姿态响应是估值、254ms
重规划间隔是在静止飞机上测的，两项都要首飞后重测再定终值。首飞按低速起。

文档：方案 7.3 由"待裁决"改为"已处置"并加生效条件；清单 H2 标记为已改。

Co-Authored-By: Claude Opus 5 <noreply@anthropic.com>
</commit_message>
<xml_diff>
--- a/Sim2Real迁移方案.docx
+++ b/Sim2Real迁移方案.docx
@@ -12887,14 +12887,15 @@
         <w:tblLayout w:type="fixed"/>
       </w:tblPr>
       <w:tblGrid>
-        <w:gridCol w:w="2551"/>
-        <w:gridCol w:w="1247"/>
-        <w:gridCol w:w="5499"/>
+        <w:gridCol w:w="2041"/>
+        <w:gridCol w:w="1134"/>
+        <w:gridCol w:w="1134"/>
+        <w:gridCol w:w="4989"/>
       </w:tblGrid>
       <w:tr>
         <w:tc>
           <w:tcPr>
-            <w:tcW w:type="dxa" w:w="2551"/>
+            <w:tcW w:type="dxa" w:w="2041"/>
           </w:tcPr>
           <w:p>
             <w:r/>
@@ -12909,7 +12910,7 @@
         </w:tc>
         <w:tc>
           <w:tcPr>
-            <w:tcW w:type="dxa" w:w="1247"/>
+            <w:tcW w:type="dxa" w:w="1134"/>
           </w:tcPr>
           <w:p>
             <w:r/>
@@ -12918,13 +12919,13 @@
                 <w:b/>
                 <w:sz w:val="18"/>
               </w:rPr>
-              <w:t>V_MAX</w:t>
-            </w:r>
-          </w:p>
-        </w:tc>
-        <w:tc>
-          <w:tcPr>
-            <w:tcW w:type="dxa" w:w="5499"/>
+              <w:t>原值</w:t>
+            </w:r>
+          </w:p>
+        </w:tc>
+        <w:tc>
+          <w:tcPr>
+            <w:tcW w:type="dxa" w:w="1134"/>
           </w:tcPr>
           <w:p>
             <w:r/>
@@ -12933,7 +12934,22 @@
                 <w:b/>
                 <w:sz w:val="18"/>
               </w:rPr>
-              <w:t>来历</w:t>
+              <w:t>现值</w:t>
+            </w:r>
+          </w:p>
+        </w:tc>
+        <w:tc>
+          <w:tcPr>
+            <w:tcW w:type="dxa" w:w="4989"/>
+          </w:tcPr>
+          <w:p>
+            <w:r/>
+            <w:r>
+              <w:rPr>
+                <w:b/>
+                <w:sz w:val="18"/>
+              </w:rPr>
+              <w:t>处置</w:t>
             </w:r>
           </w:p>
         </w:tc>
@@ -12941,7 +12957,7 @@
       <w:tr>
         <w:tc>
           <w:tcPr>
-            <w:tcW w:type="dxa" w:w="2551"/>
+            <w:tcW w:type="dxa" w:w="2041"/>
           </w:tcPr>
           <w:p>
             <w:r/>
@@ -12956,7 +12972,7 @@
         </w:tc>
         <w:tc>
           <w:tcPr>
-            <w:tcW w:type="dxa" w:w="1247"/>
+            <w:tcW w:type="dxa" w:w="1134"/>
           </w:tcPr>
           <w:p>
             <w:r/>
@@ -12971,15 +12987,30 @@
         </w:tc>
         <w:tc>
           <w:tcPr>
-            <w:tcW w:type="dxa" w:w="5499"/>
-          </w:tcPr>
-          <w:p>
-            <w:r/>
-            <w:r>
-              <w:rPr>
-                <w:sz w:val="18"/>
-              </w:rPr>
-              <w:t>真机，飞行验证后的值</w:t>
+            <w:tcW w:type="dxa" w:w="1134"/>
+          </w:tcPr>
+          <w:p>
+            <w:r/>
+            <w:r>
+              <w:rPr>
+                <w:rFonts w:ascii="Consolas" w:hAnsi="Consolas"/>
+                <w:sz w:val="17"/>
+              </w:rPr>
+              <w:t>1.0</w:t>
+            </w:r>
+          </w:p>
+        </w:tc>
+        <w:tc>
+          <w:tcPr>
+            <w:tcW w:type="dxa" w:w="4989"/>
+          </w:tcPr>
+          <w:p>
+            <w:r/>
+            <w:r>
+              <w:rPr>
+                <w:sz w:val="18"/>
+              </w:rPr>
+              <w:t>2026-10-02 已回滚（用户确认是临时改的没回滚）</w:t>
             </w:r>
           </w:p>
         </w:tc>
@@ -12987,7 +13018,7 @@
       <w:tr>
         <w:tc>
           <w:tcPr>
-            <w:tcW w:type="dxa" w:w="2551"/>
+            <w:tcW w:type="dxa" w:w="2041"/>
           </w:tcPr>
           <w:p>
             <w:r/>
@@ -13002,7 +13033,7 @@
         </w:tc>
         <w:tc>
           <w:tcPr>
-            <w:tcW w:type="dxa" w:w="1247"/>
+            <w:tcW w:type="dxa" w:w="1134"/>
           </w:tcPr>
           <w:p>
             <w:r/>
@@ -13017,15 +13048,30 @@
         </w:tc>
         <w:tc>
           <w:tcPr>
-            <w:tcW w:type="dxa" w:w="5499"/>
-          </w:tcPr>
-          <w:p>
-            <w:r/>
-            <w:r>
-              <w:rPr>
-                <w:sz w:val="18"/>
-              </w:rPr>
-              <w:t>真机，比长机低 1.0</w:t>
+            <w:tcW w:type="dxa" w:w="1134"/>
+          </w:tcPr>
+          <w:p>
+            <w:r/>
+            <w:r>
+              <w:rPr>
+                <w:rFonts w:ascii="Consolas" w:hAnsi="Consolas"/>
+                <w:sz w:val="17"/>
+              </w:rPr>
+              <w:t>1.0</w:t>
+            </w:r>
+          </w:p>
+        </w:tc>
+        <w:tc>
+          <w:tcPr>
+            <w:tcW w:type="dxa" w:w="4989"/>
+          </w:tcPr>
+          <w:p>
+            <w:r/>
+            <w:r>
+              <w:rPr>
+                <w:sz w:val="18"/>
+              </w:rPr>
+              <w:t>同上，两机统一</w:t>
             </w:r>
           </w:p>
         </w:tc>
@@ -13033,7 +13079,7 @@
       <w:tr>
         <w:tc>
           <w:tcPr>
-            <w:tcW w:type="dxa" w:w="2551"/>
+            <w:tcW w:type="dxa" w:w="2041"/>
           </w:tcPr>
           <w:p>
             <w:r/>
@@ -13048,7 +13094,7 @@
         </w:tc>
         <w:tc>
           <w:tcPr>
-            <w:tcW w:type="dxa" w:w="1247"/>
+            <w:tcW w:type="dxa" w:w="1134"/>
           </w:tcPr>
           <w:p>
             <w:r/>
@@ -13063,15 +13109,30 @@
         </w:tc>
         <w:tc>
           <w:tcPr>
-            <w:tcW w:type="dxa" w:w="5499"/>
-          </w:tcPr>
-          <w:p>
-            <w:r/>
-            <w:r>
-              <w:rPr>
-                <w:sz w:val="18"/>
-              </w:rPr>
-              <w:t>仿真场地 20×25m，赛道短</w:t>
+            <w:tcW w:type="dxa" w:w="1134"/>
+          </w:tcPr>
+          <w:p>
+            <w:r/>
+            <w:r>
+              <w:rPr>
+                <w:rFonts w:ascii="Consolas" w:hAnsi="Consolas"/>
+                <w:sz w:val="17"/>
+              </w:rPr>
+              <w:t>1.0</w:t>
+            </w:r>
+          </w:p>
+        </w:tc>
+        <w:tc>
+          <w:tcPr>
+            <w:tcW w:type="dxa" w:w="4989"/>
+          </w:tcPr>
+          <w:p>
+            <w:r/>
+            <w:r>
+              <w:rPr>
+                <w:sz w:val="18"/>
+              </w:rPr>
+              <w:t>不动（仿真已冻结）</w:t>
             </w:r>
           </w:p>
         </w:tc>
@@ -13086,9 +13147,9 @@
       <w:r>
         <w:rPr>
           <w:b/>
-          <w:color w:val="A3302C"/>
+          <w:color w:val="17695A"/>
         </w:rPr>
-        <w:t>V_MAX 的两个问题</w:t>
+        <w:t>已处置（2026-10-02）</w:t>
       </w:r>
     </w:p>
     <w:p>
@@ -13097,7 +13158,7 @@
         <w:ind w:left="240"/>
       </w:pPr>
       <w:r>
-        <w:t>① 两机不等速是编队的隐患。僚机没有独立避障，只能沿长机实飞轨迹跟；长机 3.0、僚机 2.0 时，长机一旦真的跑到 2.0 以上，僚机就只能越掉越远，而编队间距判据不会把"僚机已达速度上限"和"僚机掉队"区分开。编队飞行前两机 V_MAX 必须取同一个值。</w:t>
+        <w:t>用户确认：3.0 是临时改的、一直没回滚。两机 V_MAX 已一并改回 1.0，与仿真侧取齐。改前两台 .env 均已备份为 .env.bak-&lt;时间戳&gt;。</w:t>
       </w:r>
     </w:p>
     <w:p>
@@ -13106,10 +13167,29 @@
         <w:ind w:left="240"/>
       </w:pPr>
       <w:r>
-        <w:t>② 真机 .env 自己的注释算出的安全速度是 0.3，不是 3.0。注释里按实测反应时间 t_r=0.534s 推出"INFLATION=0.8 允许的最大速度只有 0.325 m/s（水平对角）"，并明确记录"0.5→0.4→0.3"的下调过程。现值 3.0 比那套推导高一个数量级，说明注释与取值已经脱节——要么 3.0 是后来飞出来的新结论而注释没更新，要么 3.0 是临时改的没回滚。迁移前必须让用户确认哪个是真的，这是本章唯一需要用户裁决的参数。</w:t>
+        <w:t>这一改同时消掉了两个隐患：① 两机不等速——僚机没有独立避障、只能沿长机实飞轨迹跟，长机 3.0 而僚机 2.0 时，"僚机已达速度上限"和"僚机掉队"在编队间距判据里分不开；② 取值与注释脱节——.env 自己按实测 t_r=0.534s 推出的安全速度是 0.325(水平对角)/0.265(三维最坏)，3.0 高出一个数量级。</w:t>
+      </w:r>
+    </w:p>
+    <w:p>
+      <w:pPr>
+        <w:spacing w:after="80"/>
+        <w:ind w:left="240"/>
+      </w:pPr>
+      <w:r>
+        <w:t>⚠ 仍需注意：1.0 虽然回到了仿真口径，但依旧高于上面那个 0.325 的推导值。那套推导里的 150ms 姿态响应是估值、254ms 重规划间隔是在静止飞机上测的，两项都要在首飞后重测，再回头定 V_MAX 的最终值。首飞按低速起。</w:t>
       </w:r>
     </w:p>
     <w:p/>
+    <w:p>
+      <w:r>
+        <w:rPr>
+          <w:b/>
+          <w:i w:val="0"/>
+          <w:color w:val="A3302C"/>
+        </w:rPr>
+        <w:t>⚠ 生效条件：.env 在 compose up 时读取，不是热加载。改完时两台的 flight-stack-hw 容器都在运行，容器内注入的仍是旧值（NX01=3.0、NX02=2.0）。必须 down/up 重建容器才生效——重启动作留给用户，没有代做。</w:t>
+      </w:r>
+    </w:p>
     <w:p>
       <w:pPr>
         <w:pStyle w:val="Heading2"/>

</xml_diff>

<commit_message>
docs(sim2real): 堵掉 NAMESPACE 兜底值的绕过路径
改真机 compose（本地仓库没有 docker-compose.hw.yml，只在机上）：
  NX02 (.102)  第 90/378 行  ${NAMESPACE:-NX01} -> ${NAMESPACE:-NX02}
  NX01 (.101)  两处本来就是 NX01，未改动
改前备份 docker-compose.hw.yml.bak-20261002-194607，文件里留了改动原因注释。

原先两台默认值都写 NX01。正常启动走 control_server 用 .namespace 注入、值是
对的；但绕过它裸 docker compose up 时 NX02 会落成 NAMESPACE=NX01 +
AGENT_INDEX=2 的半错状态——话题挂到 /NX01 跟真 NX01 撞，而 tgt_system=2，
比两个都错更难发现。绕过路径真实存在（NX02 的 bash_history 有裸 up 命令、
仓库里的 systemd unit 也是裸 up）。

已验证（docker compose config 渲染，未启动任何容器）：
  .101 裸启动 -> NAMESPACE=NX01 AGENT_INDEX=1
  .102 裸启动 -> NAMESPACE=NX02 AGENT_INDEX=2
  .102 显式传值仍可覆盖（传 ZZTEST 生效），control_server 主路径不受影响
运行中容器注入值未变（本来就是 NX02/2），不需要重启。

文档：方案 7.4 的绕过路径段改为"已堵"并附验证表；清单 H3 标为 P0 已完成。

Co-Authored-By: Claude Opus 5 <noreply@anthropic.com>
</commit_message>
<xml_diff>
--- a/Sim2Real迁移方案.docx
+++ b/Sim2Real迁移方案.docx
@@ -13570,9 +13570,9 @@
       <w:r>
         <w:rPr>
           <w:b/>
-          <w:color w:val="8A5A09"/>
+          <w:color w:val="17695A"/>
         </w:rPr>
-        <w:t>但有一条绕过路径，会制造"半错"状态</w:t>
+        <w:t>曾有一条绕过路径——2026-10-02 已堵</w:t>
       </w:r>
     </w:p>
     <w:p>
@@ -13581,7 +13581,7 @@
         <w:ind w:left="240"/>
       </w:pPr>
       <w:r>
-        <w:t>两台的 compose 里 NAMESPACE 默认值都仍是 ${NAMESPACE:-NX01}（第 90 行，vision-stack 的第 378 行也是）。只要绕过 control_server 直接起容器，NAMESPACE 就回落成 NX01，而 AGENT_INDEX 仍是本机 compose 里的 2。</w:t>
+        <w:t>原先两台 compose 的 NAMESPACE 默认值都写 ${NAMESPACE:-NX01}（第 90 行，vision-stack 的第 378 行也是）。正常启动走 control_server 注入、值是对的；但绕过它裸起容器，NAMESPACE 就回落成 NX01，而 AGENT_INDEX 仍是本机 compose 里的 2——NX02 变成 NAMESPACE=NX01 + AGENT_INDEX=2：话题挂到 /NX01 跟真 NX01 撞，而 mavros 的 tgt_system=2。这比"两个都错"更难发现，话题名看着像 NX01 在正常工作，实际是两台机器在同一个命名空间里互相覆盖。</w:t>
       </w:r>
     </w:p>
     <w:p>
@@ -13590,7 +13590,7 @@
         <w:ind w:left="240"/>
       </w:pPr>
       <w:r>
-        <w:t>结果是 NX02 变成 NAMESPACE=NX01 + AGENT_INDEX=2：话题挂到 /NX01 跟真 NX01 撞，而 mavros 的 tgt_system=2。这比"两个都错"更难发现——话题名看着像 NX01 正常工作，实际是两台机器在同一个命名空间里互相覆盖。</w:t>
+        <w:t>绕过路径不是假想：NX02 的 bash_history 里就有裸命令 `docker compose -f docker-compose.hw.yml up -d flight-stack-hw`；仓库里的 systemd unit flight-stack-hw.service 的 ExecStart 同样是裸 up。</w:t>
       </w:r>
     </w:p>
     <w:p>
@@ -13599,18 +13599,256 @@
         <w:ind w:left="240"/>
       </w:pPr>
       <w:r>
-        <w:t>绕过路径确实存在，不是假想：NX02 的 bash_history 里就有一条裸命令 `docker compose -f docker-compose.hw.yml up -d flight-stack-hw`，没有 NAMESPACE 前缀；仓库里还有 systemd unit flight-stack-hw.service，ExecStart 同样是裸 `docker compose up -d`（该 unit 当前未部署到 .102，但文件在仓库里，装上就会踩）。</w:t>
+        <w:t>已处置：NX02 那台两处默认值改成 ${NAMESPACE:-NX02}（.101 两处本来就是 NX01、无需改动），改前备份为 docker-compose.hw.yml.bak-&lt;时间戳&gt;。</w:t>
       </w:r>
     </w:p>
-    <w:p>
-      <w:pPr>
-        <w:spacing w:after="80"/>
-        <w:ind w:left="240"/>
-      </w:pPr>
-      <w:r>
-        <w:t>建议：把各机 compose 的 NAMESPACE 默认值改成本机实际值（NX02 那台改成 ${NAMESPACE:-NX02}），让绕过路径也得到正确结果；control_server 的注入保持不变，两层都对才安全。</w:t>
-      </w:r>
-    </w:p>
+    <w:p/>
+    <w:tbl>
+      <w:tblPr>
+        <w:tblStyle w:val="LightGrid-Accent1"/>
+        <w:tblW w:type="auto" w:w="0"/>
+        <w:jc w:val="center"/>
+        <w:tblLayout w:type="fixed"/>
+        <w:tblLook w:firstColumn="1" w:firstRow="1" w:lastColumn="0" w:lastRow="0" w:noHBand="0" w:noVBand="1" w:val="04A0"/>
+        <w:tblLayout w:type="fixed"/>
+      </w:tblPr>
+      <w:tblGrid>
+        <w:gridCol w:w="3969"/>
+        <w:gridCol w:w="1928"/>
+        <w:gridCol w:w="3402"/>
+      </w:tblGrid>
+      <w:tr>
+        <w:tc>
+          <w:tcPr>
+            <w:tcW w:type="dxa" w:w="3969"/>
+          </w:tcPr>
+          <w:p>
+            <w:r/>
+            <w:r>
+              <w:rPr>
+                <w:b/>
+                <w:sz w:val="18"/>
+              </w:rPr>
+              <w:t>验证项</w:t>
+            </w:r>
+          </w:p>
+        </w:tc>
+        <w:tc>
+          <w:tcPr>
+            <w:tcW w:type="dxa" w:w="1928"/>
+          </w:tcPr>
+          <w:p>
+            <w:r/>
+            <w:r>
+              <w:rPr>
+                <w:b/>
+                <w:sz w:val="18"/>
+              </w:rPr>
+              <w:t>.101</w:t>
+            </w:r>
+          </w:p>
+        </w:tc>
+        <w:tc>
+          <w:tcPr>
+            <w:tcW w:type="dxa" w:w="3402"/>
+          </w:tcPr>
+          <w:p>
+            <w:r/>
+            <w:r>
+              <w:rPr>
+                <w:b/>
+                <w:sz w:val="18"/>
+              </w:rPr>
+              <w:t>.102</w:t>
+            </w:r>
+          </w:p>
+        </w:tc>
+      </w:tr>
+      <w:tr>
+        <w:tc>
+          <w:tcPr>
+            <w:tcW w:type="dxa" w:w="3969"/>
+          </w:tcPr>
+          <w:p>
+            <w:r/>
+            <w:r>
+              <w:rPr>
+                <w:sz w:val="18"/>
+              </w:rPr>
+              <w:t>裸启动（不带 NAMESPACE）解析出的 NAMESPACE</w:t>
+            </w:r>
+          </w:p>
+        </w:tc>
+        <w:tc>
+          <w:tcPr>
+            <w:tcW w:type="dxa" w:w="1928"/>
+          </w:tcPr>
+          <w:p>
+            <w:r/>
+            <w:r>
+              <w:rPr>
+                <w:rFonts w:ascii="Consolas" w:hAnsi="Consolas"/>
+                <w:sz w:val="17"/>
+              </w:rPr>
+              <w:t>NX01</w:t>
+            </w:r>
+          </w:p>
+        </w:tc>
+        <w:tc>
+          <w:tcPr>
+            <w:tcW w:type="dxa" w:w="3402"/>
+          </w:tcPr>
+          <w:p>
+            <w:r/>
+            <w:r>
+              <w:rPr>
+                <w:rFonts w:ascii="Consolas" w:hAnsi="Consolas"/>
+                <w:sz w:val="17"/>
+              </w:rPr>
+              <w:t>NX02</w:t>
+            </w:r>
+          </w:p>
+        </w:tc>
+      </w:tr>
+      <w:tr>
+        <w:tc>
+          <w:tcPr>
+            <w:tcW w:type="dxa" w:w="3969"/>
+          </w:tcPr>
+          <w:p>
+            <w:r/>
+            <w:r>
+              <w:rPr>
+                <w:sz w:val="18"/>
+              </w:rPr>
+              <w:t>裸启动解析出的 AGENT_INDEX</w:t>
+            </w:r>
+          </w:p>
+        </w:tc>
+        <w:tc>
+          <w:tcPr>
+            <w:tcW w:type="dxa" w:w="1928"/>
+          </w:tcPr>
+          <w:p>
+            <w:r/>
+            <w:r>
+              <w:rPr>
+                <w:rFonts w:ascii="Consolas" w:hAnsi="Consolas"/>
+                <w:sz w:val="17"/>
+              </w:rPr>
+              <w:t>1</w:t>
+            </w:r>
+          </w:p>
+        </w:tc>
+        <w:tc>
+          <w:tcPr>
+            <w:tcW w:type="dxa" w:w="3402"/>
+          </w:tcPr>
+          <w:p>
+            <w:r/>
+            <w:r>
+              <w:rPr>
+                <w:rFonts w:ascii="Consolas" w:hAnsi="Consolas"/>
+                <w:sz w:val="17"/>
+              </w:rPr>
+              <w:t>2</w:t>
+            </w:r>
+          </w:p>
+        </w:tc>
+      </w:tr>
+      <w:tr>
+        <w:tc>
+          <w:tcPr>
+            <w:tcW w:type="dxa" w:w="3969"/>
+          </w:tcPr>
+          <w:p>
+            <w:r/>
+            <w:r>
+              <w:rPr>
+                <w:sz w:val="18"/>
+              </w:rPr>
+              <w:t>显式传 NAMESPACE 时仍被覆盖</w:t>
+            </w:r>
+          </w:p>
+        </w:tc>
+        <w:tc>
+          <w:tcPr>
+            <w:tcW w:type="dxa" w:w="1928"/>
+          </w:tcPr>
+          <w:p>
+            <w:r/>
+            <w:r>
+              <w:rPr>
+                <w:rFonts w:ascii="Consolas" w:hAnsi="Consolas"/>
+                <w:sz w:val="17"/>
+              </w:rPr>
+              <w:t>—</w:t>
+            </w:r>
+          </w:p>
+        </w:tc>
+        <w:tc>
+          <w:tcPr>
+            <w:tcW w:type="dxa" w:w="3402"/>
+          </w:tcPr>
+          <w:p>
+            <w:r/>
+            <w:r>
+              <w:rPr>
+                <w:rFonts w:ascii="Consolas" w:hAnsi="Consolas"/>
+                <w:sz w:val="17"/>
+              </w:rPr>
+              <w:t>已验证（传 ZZTEST 生效）</w:t>
+            </w:r>
+          </w:p>
+        </w:tc>
+      </w:tr>
+      <w:tr>
+        <w:tc>
+          <w:tcPr>
+            <w:tcW w:type="dxa" w:w="3969"/>
+          </w:tcPr>
+          <w:p>
+            <w:r/>
+            <w:r>
+              <w:rPr>
+                <w:sz w:val="18"/>
+              </w:rPr>
+              <w:t>运行中容器</w:t>
+            </w:r>
+          </w:p>
+        </w:tc>
+        <w:tc>
+          <w:tcPr>
+            <w:tcW w:type="dxa" w:w="1928"/>
+          </w:tcPr>
+          <w:p>
+            <w:r/>
+            <w:r>
+              <w:rPr>
+                <w:rFonts w:ascii="Consolas" w:hAnsi="Consolas"/>
+                <w:sz w:val="17"/>
+              </w:rPr>
+              <w:t>NX01 / 1</w:t>
+            </w:r>
+          </w:p>
+        </w:tc>
+        <w:tc>
+          <w:tcPr>
+            <w:tcW w:type="dxa" w:w="3402"/>
+          </w:tcPr>
+          <w:p>
+            <w:r/>
+            <w:r>
+              <w:rPr>
+                <w:rFonts w:ascii="Consolas" w:hAnsi="Consolas"/>
+                <w:sz w:val="17"/>
+              </w:rPr>
+              <w:t>NX02 / 2（本来就对，无需重启）</w:t>
+            </w:r>
+          </w:p>
+        </w:tc>
+      </w:tr>
+    </w:tbl>
     <w:p/>
     <w:p>
       <w:r>
@@ -13620,7 +13858,18 @@
           <w:color w:val="5A6472"/>
           <w:sz w:val="18"/>
         </w:rPr>
-        <w:t>⚠ 与此相关但未解决：此前记录的"两架 tgt_system 都是 1、共用 /uas1"互串故障，按本次实测的 AGENT_INDEX=1/2 来看，在当前启动方式下不会复现。该故障当时的具体启动方式已不可考，按上面的绕过路径解释得通。双机同时上电前仍应现场核一遍容器注入值，不要只看 .env。</w:t>
+        <w:t>两层现在都对：control_server 的注入是主路径，compose 默认值是兜底，任一条单独成立。本项改动只影响将来的裸 up，当前运行的容器值没变，不需要重启。</w:t>
+      </w:r>
+    </w:p>
+    <w:p>
+      <w:r>
+        <w:rPr>
+          <w:b w:val="0"/>
+          <w:i w:val="0"/>
+          <w:color w:val="5A6472"/>
+          <w:sz w:val="18"/>
+        </w:rPr>
+        <w:t>⚠ 相关：此前记录的"两架 tgt_system 都是 1、共用 /uas1"互串故障，按本次实测的 AGENT_INDEX=1/2 来看，在当前启动方式下不会复现。该故障当时的具体启动方式已不可考，按上面的绕过路径解释得通。双机同时上电前仍应现场核一遍容器注入值，不要只看 .env。</w:t>
       </w:r>
     </w:p>
     <w:p>

</xml_diff>